<commit_message>
docs(laboratorio): anexos con Gmail, insumos y respaldo configurados; agente1 0.5.5 (#147)
El scheduler corre solo en el servidor desde el 26/10 y sube el respaldo
diario a Drive. El Anexo 1 declara la foto del 26/10 y deja como no
demostrado sólo los Forms.

Co-Authored-By: Claude Opus 5.5 <noreply@anthropic.com>
</commit_message>
<xml_diff>
--- a/Documentos/Laboratorio/Entrega/Anexo1-Presentacion.docx
+++ b/Documentos/Laboratorio/Entrega/Anexo1-Presentacion.docx
@@ -201,12 +201,12 @@
     </w:p>
     <w:p>
       <w:r>
-        <w:t>Este anexo declara el estado de las capacidades contra el gate TRL 4. Las cifras y los estados de las tablas por estrato son los de la foto declarada en el corte del 23/10/2026, versión 0.5.4 (tag agente1-v0.5.4). La nota sobre fechas y estado verificado del anteproyecto conserva el corte del 21/09/2026; cuando uno y otro citan un número, corresponde a su propia fecha, y la revisión de laboratorio evalúa la foto de este anexo.</w:t>
-      </w:r>
-    </w:p>
-    <w:p>
-      <w:r>
-        <w:t>Demostrado sobre el sistema de demostración. El 23/10/2026, desde el contenedor del servidor y con la cuenta de servicio: smoke de lectura, gacetilla y posts de Instagram y LinkedIn de extremo a extremo con borrador real en la carpeta autorizada (sin modificar nada existente), el circuito completo de HU-012/HU-013 y de HU-014 contra destinos de prueba, el scheduler procesando un insumo de A3, el respaldo con su restauración, la vuelta atrás de versión y la recuperación ante una caída del proceso. HU-010 a HU-014 están implementadas dentro del alcance declarado: la gacetilla declara los siete tipos del corpus, dos que generan prosa con prompt propio (difusión de actividad y saludo o efeméride) y cinco que extraen y confirman sin prosa del modelo (crónica de evento, aviso de otra área, convocatoria interna, fallecimiento y newsletter), cada tipo con su forma declarada, su contrato de entrada y su gate, y un renderer único que escribe las partes institucionales fijas, que el modelo nunca escribe (#121); además post, plantilla de correo por actividad y certificado con línea descriptiva y circuito de lote. La suite y las matrices por historia las ejercitan, y cada fila A o B de las tablas por estrato cita su evidencia versionada y su paso en vivo.</w:t>
+        <w:t>Este anexo declara el estado de las capacidades contra el gate TRL 4. Las cifras y los estados de las tablas por estrato son los de la foto declarada en el corte del 26/10/2026, versión 0.5.5 (tag agente1-v0.5.5). La nota sobre fechas y estado verificado del anteproyecto conserva el corte del 21/09/2026; cuando uno y otro citan un número, corresponde a su propia fecha, y la revisión de laboratorio evalúa la foto de este anexo.</w:t>
+      </w:r>
+    </w:p>
+    <w:p>
+      <w:r>
+        <w:t>Demostrado sobre el sistema de demostración. El 23/10/2026, desde el contenedor del servidor y con la cuenta de servicio: smoke de lectura, gacetilla y posts de Instagram y LinkedIn de extremo a extremo con borrador real en la carpeta autorizada (sin modificar nada existente), el circuito completo de HU-012/HU-013 y de HU-014 contra destinos de prueba, el envío real por Gmail a la lista de prueba, el scheduler tomando un insumo de A3 de la pestaña de la planilla, el respaldo en Drive con su restauración, la vuelta atrás de versión y la recuperación ante una caída del proceso. Desde el 26/10 el scheduler corre solo en el servidor y sube el respaldo diario. HU-010 a HU-014 están implementadas dentro del alcance declarado: la gacetilla declara los siete tipos del corpus, dos que generan prosa con prompt propio (difusión de actividad y saludo o efeméride) y cinco que extraen y confirman sin prosa del modelo (crónica de evento, aviso de otra área, convocatoria interna, fallecimiento y newsletter), cada tipo con su forma declarada, su contrato de entrada y su gate, y un renderer único que escribe las partes institucionales fijas, que el modelo nunca escribe (#121); además post, plantilla de correo por actividad y certificado con línea descriptiva y circuito de lote. La suite y las matrices por historia las ejercitan, y cada fila A o B de las tablas por estrato cita su evidencia versionada y su paso en vivo.</w:t>
       </w:r>
     </w:p>
     <w:p>
@@ -226,12 +226,12 @@
     </w:p>
     <w:p>
       <w:r>
-        <w:t>• El envío real por Gmail y los Forms reales de HU-012, HU-013 y HU-014: el circuito completo corre contra destinos de prueba declarados y la lista de prueba de Gmail; los Forms y las variables de la emisión real no están configurados en el servidor.</w:t>
-      </w:r>
-    </w:p>
-    <w:p>
-      <w:r>
-        <w:t>• La unidad compartida institucional de D3: el cómputo corre en el servidor de la facultad, pero los recursos de Google siguen siendo los de D2 (issue #100). El scheduler del contenedor queda apagado hasta configurar la pestaña de insumos.</w:t>
+        <w:t>• Los Forms reales de HU-012, HU-013 y HU-014: el circuito completo corre contra destinos de prueba declarados. Gmail está configurado en el servidor con la lista de prueba (envío verificado el 23/10), pero los Forms de pedidos y de decisiones todavía no están definidos.</w:t>
+      </w:r>
+    </w:p>
+    <w:p>
+      <w:r>
+        <w:t>• La unidad compartida institucional de D3: el cómputo corre en el servidor de la facultad, pero los recursos de Google siguen siendo los de D2 (issue #100).</w:t>
       </w:r>
     </w:p>
     <w:p>
@@ -1965,7 +1965,7 @@
               <w:rPr>
                 <w:sz w:val="18"/>
               </w:rPr>
-              <w:t>Idempotencia durable verificada: el registro archivo-por-clave sobrevive reinicio y una reserva colgada se reconcilia sin reenviar. Respaldo diario implementado (#86, ADR 0009) y probado desde el contenedor el 23/10 sobre el estado de un lote de HU-012: 13 archivos respaldados con manifiesto sha256 y restaurados idénticos, sin pisar lo existente. La vuelta atrás de versión por la rama deploy también se probó. Observación: el respaldo corrió contra la carpeta local declarada (AGENTE1_RESPALDO_CARPETA_FAKE), no contra Drive, y los SLO de RPO y RTO no tienen nivel medido (#88)</w:t>
+              <w:t>Idempotencia durable verificada: el registro archivo-por-clave sobrevive reinicio y una reserva colgada se reconcilia sin reenviar. Respaldo diario implementado (#86, ADR 0009) y probado desde el contenedor el 23/10 sobre el estado de un lote de HU-012: 13 archivos respaldados con manifiesto sha256 y restaurados idénticos, sin pisar lo existente. Desde el 23/10 el respaldo va a la carpeta privada de la cuenta técnica en Drive: un respaldo subido, bajado y restaurado idéntico, y desde el 26/10 el scheduler del contenedor lo sube solo una vez por día. La vuelta atrás de versión por la rama deploy también se probó. Observación: los SLO de RPO y RTO no tienen nivel medido (#88)</w:t>
             </w:r>
           </w:p>
         </w:tc>
@@ -2392,7 +2392,7 @@
               <w:rPr>
                 <w:sz w:val="18"/>
               </w:rPr>
-              <w:t>Workspace D2 verificado en vivo (parte A): el 28/09 con OAuth y, desde el 21/10, con la cuenta de servicio de DSI desde el servidor. El 23/10, desde el contenedor: smoke de lectura, gacetilla y posts de Instagram y LinkedIn con Doc real BORRADOR — NO PUBLICAR en la carpeta autorizada, sin tocar nada existente. Insumos de A3 por productor provisional declarado (parte B): el scheduler los procesó en el contenedor. Seam de A2 offline sin transporte ni contrato cerrado, y A4/A5 con sólo contrato candidato (parte C, previstas)</w:t>
+              <w:t>Workspace D2 verificado en vivo (parte A): el 28/09 con OAuth y, desde el 21/10, con la cuenta de servicio de DSI desde el servidor. El 23/10, desde el contenedor: smoke de lectura, gacetilla y posts de Instagram y LinkedIn con Doc real BORRADOR — NO PUBLICAR en la carpeta autorizada, sin tocar nada existente. Insumos de A3 por productor provisional declarado (parte B): el scheduler los toma de la pestaña «Insumos de agentes» de la planilla D2 y escribe el Doc borrador (probado en vivo el 23/10; el scheduler corre solo desde el 26/10). Seam de A2 offline sin transporte ni contrato cerrado, y A4/A5 con sólo contrato candidato (parte C, previstas)</w:t>
             </w:r>
           </w:p>
         </w:tc>

</xml_diff>

<commit_message>
docs(laboratorio): anexos sin referencias viejas; agente1 0.5.6 (#147)
La foto de los tres anexos pasa a 0.5.6 (26/10). Se corrigen datos
viejos: encabezados de los perfiles en 0.5.4, capacidad con la medición
de llama3.2:3b y PENDIENTE #51 (cerrado), SLO sin mencionar que el
instrumento de #88 existe, cantidad de versiones desplegadas, defecto
citado como «de esta foto» y propiedad de los recursos de Google en A
con #100 abierto (pasa a B). El Form de pedidos queda previsto en el
scheduler (#149). Fuera de los anexos: ADR 0013, runbook del scheduler,
inventario y guion de la prueba presencial ya no lo dan por apagado.

Co-Authored-By: Claude Opus 5.5 <noreply@anthropic.com>
</commit_message>
<xml_diff>
--- a/Documentos/Laboratorio/Entrega/Anexo1-Presentacion.docx
+++ b/Documentos/Laboratorio/Entrega/Anexo1-Presentacion.docx
@@ -201,7 +201,7 @@
     </w:p>
     <w:p>
       <w:r>
-        <w:t>Este anexo declara el estado de las capacidades contra el gate TRL 4. Las cifras y los estados de las tablas por estrato son los de la foto declarada en el corte del 26/10/2026, versión 0.5.5 (tag agente1-v0.5.5). La nota sobre fechas y estado verificado del anteproyecto conserva el corte del 21/09/2026; cuando uno y otro citan un número, corresponde a su propia fecha, y la revisión de laboratorio evalúa la foto de este anexo.</w:t>
+        <w:t>Este anexo declara el estado de las capacidades contra el gate TRL 4. Las cifras y los estados de las tablas por estrato son los de la foto declarada en el corte del 26/10/2026, versión 0.5.6 (tag agente1-v0.5.6). La nota sobre fechas y estado verificado del anteproyecto conserva el corte del 21/09/2026; cuando uno y otro citan un número, corresponde a su propia fecha, y la revisión de laboratorio evalúa la foto de este anexo.</w:t>
       </w:r>
     </w:p>
     <w:p>
@@ -226,7 +226,7 @@
     </w:p>
     <w:p>
       <w:r>
-        <w:t>• Los Forms reales de HU-012, HU-013 y HU-014: el circuito completo corre contra destinos de prueba declarados. Gmail está configurado en el servidor con la lista de prueba (envío verificado el 23/10), pero los Forms de pedidos y de decisiones todavía no están definidos.</w:t>
+        <w:t>• Los Forms reales de HU-012, HU-013 y HU-014: el circuito completo corre contra destinos de prueba declarados. Gmail está configurado en el servidor con la lista de prueba (envío verificado el 23/10), pero los Forms de pedidos y de decisiones todavía no están definidos. Cuando existan, está previsto que el scheduler atienda el Form de pedidos en cada corrida (issue #149).</w:t>
       </w:r>
     </w:p>
     <w:p>
@@ -236,7 +236,7 @@
     </w:p>
     <w:p>
       <w:r>
-        <w:t>• Los niveles verificados de los SLO de disponibilidad, tiempo de atención, aprobación a envío y RPO/RTO no tienen medición a la fecha (issue #88); la latencia por pieza sí está medida en el servidor. El perfil declara la ausencia en lugar de un número.</w:t>
+        <w:t>• Los niveles verificados de los SLO de disponibilidad, tiempo de atención, aprobación a envío y RPO/RTO: el instrumento de medición existe (issue #88) y el scheduler registra cada corrida desde el 26/10, pero todavía no hay una ventana de operación que medir. La latencia por pieza sí está medida en el servidor. El perfil declara la ausencia en lugar de un número.</w:t>
       </w:r>
     </w:p>
     <w:p>
@@ -2708,7 +2708,7 @@
               <w:rPr>
                 <w:sz w:val="18"/>
               </w:rPr>
-              <w:t>Se instala en el servidor como un stack de Portainer: el CI publica la imagen al cortar una versión y Portainer la despliega solo desde la rama deploy. El 23/10 se desplegaron así cuatro versiones (0.5.0 a 0.5.3) y una vuelta atrás. La instalación por un tercero (el operador del traspaso, con su propio usuario de Portainer) está prevista para diciembre-febrero</w:t>
+              <w:t>Se instala en el servidor como un stack de Portainer: el CI publica la imagen al cortar una versión y Portainer la despliega solo desde la rama deploy. Del 23/10 al 26/10 se desplegaron así seis versiones (0.5.0 a 0.5.5) y una vuelta atrás; la 0.5.5 se desplegó sola, con el scheduler corriendo, sin intervención en el servidor. La instalación por un tercero (el operador del traspaso, con su propio usuario de Portainer) está prevista para diciembre-febrero</w:t>
             </w:r>
           </w:p>
         </w:tc>

</xml_diff>

<commit_message>
fix(laboratorio): ciclo lectivo 2026 y referencias en los anexos; agente1 0.5.7 (#147)
Las plantillas oficiales son las de 2025 y los tres Word decían «Ciclo
Lectivo 2025» en el encabezado. Ahora el generador lo actualiza al ciclo
vigente. En los anexos 2 y 3 sale la aclaración «datos puntuales a modo
de ejemplo» y la instrucción al equipo de proyecto cede su lugar a las
referencias. Las columnas de nivel y comentarios siguen vacías: las
completa el laboratorio (correo del 14/10).

Co-Authored-By: Claude Opus 5.5 <noreply@anthropic.com>
</commit_message>
<xml_diff>
--- a/Documentos/Laboratorio/Entrega/Anexo1-Presentacion.docx
+++ b/Documentos/Laboratorio/Entrega/Anexo1-Presentacion.docx
@@ -201,7 +201,7 @@
     </w:p>
     <w:p>
       <w:r>
-        <w:t>Este anexo declara el estado de las capacidades contra el gate TRL 4. Las cifras y los estados de las tablas por estrato son los de la foto declarada en el corte del 26/10/2026, versión 0.5.6 (tag agente1-v0.5.6). La nota sobre fechas y estado verificado del anteproyecto conserva el corte del 21/09/2026; cuando uno y otro citan un número, corresponde a su propia fecha, y la revisión de laboratorio evalúa la foto de este anexo.</w:t>
+        <w:t>Este anexo declara el estado de las capacidades contra el gate TRL 4. Las cifras y los estados de las tablas por estrato son los de la foto declarada en el corte del 26/10/2026, versión 0.5.7 (tag agente1-v0.5.7). La nota sobre fechas y estado verificado del anteproyecto conserva el corte del 21/09/2026; cuando uno y otro citan un número, corresponde a su propia fecha, y la revisión de laboratorio evalúa la foto de este anexo.</w:t>
       </w:r>
     </w:p>
     <w:p>
@@ -3064,7 +3064,7 @@
         <w:i/>
         <w:iCs/>
       </w:rPr>
-      <w:t>Ciclo Lectivo 202</w:t>
+      <w:t>Ciclo Lectivo 2026</w:t>
     </w:r>
     <w:r>
       <w:rPr>
@@ -3072,7 +3072,6 @@
         <w:i/>
         <w:iCs/>
       </w:rPr>
-      <w:t>5</w:t>
     </w:r>
   </w:p>
 </w:hdr>

</xml_diff>

<commit_message>
feat(laboratorio): la seguridad se declara por componente en el Anexo 1; agente1 0.5.8 (#147)
El Anexo 1 remitía la seguridad al Anexo 3, pero el Word del Anexo 3
sólo lleva componente e ítem: el laboratorio no veía el estado ni el
motivo que declara el autor. Ahora cada componente del Anexo 1 lleva
los mismos ítems que el Anexo 3, con estado y motivo del perfil de
seguridad, y Google Workspace entra como componente propio, como en el
ejemplo aprobado de 2025.

Co-Authored-By: Claude Opus 5.5 <noreply@anthropic.com>
</commit_message>
<xml_diff>
--- a/Documentos/Laboratorio/Entrega/Anexo1-Presentacion.docx
+++ b/Documentos/Laboratorio/Entrega/Anexo1-Presentacion.docx
@@ -65,7 +65,7 @@
     </w:p>
     <w:p>
       <w:r>
-        <w:t>Este documento es el Anexo 1 de la revisión de laboratorio: presenta el sistema de demostración (el Agente 1 en todo su alcance declarado, funcionando de punta a punta en vivo) y su perfil de calidad por estrato. El detalle por atributo, en el orden del estándar, está en el Anexo 2; el perfil de seguridad, en el Anexo 3.</w:t>
+        <w:t>Este documento es el Anexo 1 de la revisión de laboratorio: presenta el sistema de demostración (el Agente 1 en todo su alcance declarado, funcionando de punta a punta en vivo) y su perfil de calidad y de seguridad por componente, con el estado y el motivo que declara el autor. El Anexo 2 (calidad, en el orden del estándar) y el Anexo 3 (seguridad) listan los mismos atributos e ítems para que el laboratorio los califique.</w:t>
       </w:r>
     </w:p>
     <w:p>
@@ -201,7 +201,7 @@
     </w:p>
     <w:p>
       <w:r>
-        <w:t>Este anexo declara el estado de las capacidades contra el gate TRL 4. Las cifras y los estados de las tablas por estrato son los de la foto declarada en el corte del 26/10/2026, versión 0.5.7 (tag agente1-v0.5.7). La nota sobre fechas y estado verificado del anteproyecto conserva el corte del 21/09/2026; cuando uno y otro citan un número, corresponde a su propia fecha, y la revisión de laboratorio evalúa la foto de este anexo.</w:t>
+        <w:t>Este anexo declara el estado de las capacidades contra el gate TRL 4. Las cifras y los estados de las tablas por estrato son los de la foto declarada en el corte del 26/10/2026, versión 0.5.8 (tag agente1-v0.5.8). La nota sobre fechas y estado verificado del anteproyecto conserva el corte del 21/09/2026; cuando uno y otro citan un número, corresponde a su propia fecha, y la revisión de laboratorio evalúa la foto de este anexo.</w:t>
       </w:r>
     </w:p>
     <w:p>
@@ -337,6 +337,11 @@
     </w:p>
     <w:p>
       <w:r>
+        <w:t>• Google Workspace: Plataforma institucional de la FIE sobre la que se apoyan la identidad del agente (una cuenta de servicio de DSI que actúa como la cuenta técnica), los recursos y la auditoría del lado de Google. No es un módulo del agente: se declara aparte porque su seguridad tiene un modelo propio, con riesgos aceptados por DSI.</w:t>
+      </w:r>
+    </w:p>
+    <w:p>
+      <w:r>
         <w:t>• Sistema (atributos transversales): Atributos transversales que ninguna capa ejerce sola: ausencia de fallos, disponibilidad, operabilidad, mantenibilidad, instalabilidad y los atributos de calidad de datos que dependen del dueño funcional.</w:t>
       </w:r>
     </w:p>
@@ -412,7 +417,7 @@
     </w:p>
     <w:p>
       <w:r>
-        <w:t>Atributos tenidos en cuenta en cada componente, con el estado de implementación declarado por el autor y su motivo. La escala de estados es la de la revisión de laboratorio: A implementado satisfactoriamente, B implementado con observaciones, C tenido en cuenta sin implementar y D desconocido o ignorado expresamente (D lo asigna el laboratorio). Los factores de (ciber)seguridad de cada estrato se declaran en el Anexo 3.</w:t>
+        <w:t>Atributos tenidos en cuenta en cada componente, con el estado de implementación declarado por el autor y su motivo. La escala de estados es la de la revisión de laboratorio: A implementado satisfactoriamente, B implementado con observaciones, C tenido en cuenta sin implementar y D desconocido o ignorado expresamente (D lo asigna el laboratorio). Las filas de Seguridad son los ítems de (ciber)seguridad de cada componente, los mismos que lista el Anexo 3; RA (riesgo aceptado) califica un A o un B, y el motivo dice quién lo aceptó y con qué compensación.</w:t>
       </w:r>
     </w:p>
     <w:tbl>
@@ -617,33 +622,115 @@
               <w:rPr>
                 <w:sz w:val="18"/>
               </w:rPr>
-              <w:t>Seguridad · Factores de (ciber)seguridad del estrato</w:t>
-            </w:r>
-          </w:p>
-        </w:tc>
-        <w:tc>
-          <w:tcPr>
-            <w:tcW w:type="dxa" w:w="2835"/>
-          </w:tcPr>
-          <w:p>
-            <w:r>
-              <w:rPr>
-                <w:sz w:val="18"/>
-              </w:rPr>
-              <w:t>Remite</w:t>
-            </w:r>
-          </w:p>
-        </w:tc>
-        <w:tc>
-          <w:tcPr>
-            <w:tcW w:type="dxa" w:w="2835"/>
-          </w:tcPr>
-          <w:p>
-            <w:r>
-              <w:rPr>
-                <w:sz w:val="18"/>
-              </w:rPr>
-              <w:t>El perfil de seguridad de este estrato se declara en el Anexo 3 del laboratorio (perfil de seguridad del sistema de demostración, issues #58 y #108); este anexo lo remite y no lo reescribe.</w:t>
+              <w:t>Seguridad (autenticación) · Identidad y rol del pedido</w:t>
+            </w:r>
+          </w:p>
+        </w:tc>
+        <w:tc>
+          <w:tcPr>
+            <w:tcW w:type="dxa" w:w="2835"/>
+          </w:tcPr>
+          <w:p>
+            <w:r>
+              <w:rPr>
+                <w:sz w:val="18"/>
+              </w:rPr>
+              <w:t>A</w:t>
+            </w:r>
+          </w:p>
+        </w:tc>
+        <w:tc>
+          <w:tcPr>
+            <w:tcW w:type="dxa" w:w="2835"/>
+          </w:tcPr>
+          <w:p>
+            <w:r>
+              <w:rPr>
+                <w:sz w:val="18"/>
+              </w:rPr>
+              <w:t>El canal de pedidos es un Form restringido al dominio de la FIE con correo verificado; el rol sale del padrón externo y quien no figura recibe el rol centinela no_en_padron, que no está habilitado: el pedido se rechaza y se registra (ADR 0005)</w:t>
+            </w:r>
+          </w:p>
+        </w:tc>
+      </w:tr>
+      <w:tr>
+        <w:tc>
+          <w:tcPr>
+            <w:tcW w:type="dxa" w:w="2835"/>
+          </w:tcPr>
+          <w:p>
+            <w:r>
+              <w:rPr>
+                <w:sz w:val="18"/>
+              </w:rPr>
+              <w:t>Seguridad (confidencialidad) · No persistencia de la prosa del pedido</w:t>
+            </w:r>
+          </w:p>
+        </w:tc>
+        <w:tc>
+          <w:tcPr>
+            <w:tcW w:type="dxa" w:w="2835"/>
+          </w:tcPr>
+          <w:p>
+            <w:r>
+              <w:rPr>
+                <w:sz w:val="18"/>
+              </w:rPr>
+              <w:t>A</w:t>
+            </w:r>
+          </w:p>
+        </w:tc>
+        <w:tc>
+          <w:tcPr>
+            <w:tcW w:type="dxa" w:w="2835"/>
+          </w:tcPr>
+          <w:p>
+            <w:r>
+              <w:rPr>
+                <w:sz w:val="18"/>
+              </w:rPr>
+              <w:t>La prosa no se guarda: ni en el registro de atendidos, ni en el aviso, ni en el link de repregunta, que usa un identificador institucional determinístico</w:t>
+            </w:r>
+          </w:p>
+        </w:tc>
+      </w:tr>
+      <w:tr>
+        <w:tc>
+          <w:tcPr>
+            <w:tcW w:type="dxa" w:w="2835"/>
+          </w:tcPr>
+          <w:p>
+            <w:r>
+              <w:rPr>
+                <w:sz w:val="18"/>
+              </w:rPr>
+              <w:t>Seguridad (robustez ante entradas no confiables) · La prosa del pedido es dato, nunca instrucción</w:t>
+            </w:r>
+          </w:p>
+        </w:tc>
+        <w:tc>
+          <w:tcPr>
+            <w:tcW w:type="dxa" w:w="2835"/>
+          </w:tcPr>
+          <w:p>
+            <w:r>
+              <w:rPr>
+                <w:sz w:val="18"/>
+              </w:rPr>
+              <w:t>A</w:t>
+            </w:r>
+          </w:p>
+        </w:tc>
+        <w:tc>
+          <w:tcPr>
+            <w:tcW w:type="dxa" w:w="2835"/>
+          </w:tcPr>
+          <w:p>
+            <w:r>
+              <w:rPr>
+                <w:sz w:val="18"/>
+              </w:rPr>
+              <w:t>Un intento de inyección en la prosa produce una intención válida del catálogo o un rechazo; nunca llega como instrucción al prompt del generador y nunca se persiste en claro (ADR 0001)</w:t>
             </w:r>
           </w:p>
         </w:tc>
@@ -851,33 +938,115 @@
               <w:rPr>
                 <w:sz w:val="18"/>
               </w:rPr>
-              <w:t>Seguridad · Factores de (ciber)seguridad del estrato</w:t>
-            </w:r>
-          </w:p>
-        </w:tc>
-        <w:tc>
-          <w:tcPr>
-            <w:tcW w:type="dxa" w:w="2835"/>
-          </w:tcPr>
-          <w:p>
-            <w:r>
-              <w:rPr>
-                <w:sz w:val="18"/>
-              </w:rPr>
-              <w:t>Remite</w:t>
-            </w:r>
-          </w:p>
-        </w:tc>
-        <w:tc>
-          <w:tcPr>
-            <w:tcW w:type="dxa" w:w="2835"/>
-          </w:tcPr>
-          <w:p>
-            <w:r>
-              <w:rPr>
-                <w:sz w:val="18"/>
-              </w:rPr>
-              <w:t>El perfil de seguridad de este estrato se declara en el Anexo 3 del laboratorio (perfil de seguridad del sistema de demostración, issues #58 y #108); este anexo lo remite y no lo reescribe.</w:t>
+              <w:t>Seguridad (autorización) · Catálogo cerrado de intenciones</w:t>
+            </w:r>
+          </w:p>
+        </w:tc>
+        <w:tc>
+          <w:tcPr>
+            <w:tcW w:type="dxa" w:w="2835"/>
+          </w:tcPr>
+          <w:p>
+            <w:r>
+              <w:rPr>
+                <w:sz w:val="18"/>
+              </w:rPr>
+              <w:t>A</w:t>
+            </w:r>
+          </w:p>
+        </w:tc>
+        <w:tc>
+          <w:tcPr>
+            <w:tcW w:type="dxa" w:w="2835"/>
+          </w:tcPr>
+          <w:p>
+            <w:r>
+              <w:rPr>
+                <w:sz w:val="18"/>
+              </w:rPr>
+              <w:t>Una solicitud fuera de alcance se rechaza; no se aproxima a la intención más parecida; el contenido de la planilla de actividades no entra a ningún prompt (ADR 0001)</w:t>
+            </w:r>
+          </w:p>
+        </w:tc>
+      </w:tr>
+      <w:tr>
+        <w:tc>
+          <w:tcPr>
+            <w:tcW w:type="dxa" w:w="2835"/>
+          </w:tcPr>
+          <w:p>
+            <w:r>
+              <w:rPr>
+                <w:sz w:val="18"/>
+              </w:rPr>
+              <w:t>Seguridad (trazabilidad) · Registro sin prosa ni identidad en claro</w:t>
+            </w:r>
+          </w:p>
+        </w:tc>
+        <w:tc>
+          <w:tcPr>
+            <w:tcW w:type="dxa" w:w="2835"/>
+          </w:tcPr>
+          <w:p>
+            <w:r>
+              <w:rPr>
+                <w:sz w:val="18"/>
+              </w:rPr>
+              <w:t>A</w:t>
+            </w:r>
+          </w:p>
+        </w:tc>
+        <w:tc>
+          <w:tcPr>
+            <w:tcW w:type="dxa" w:w="2835"/>
+          </w:tcPr>
+          <w:p>
+            <w:r>
+              <w:rPr>
+                <w:sz w:val="18"/>
+              </w:rPr>
+              <w:t>El registro de interacciones conserva sólo el derivado estructurado y la identidad hasheada; la interacción pendiente guarda lo que produjo el agente, nunca prosa del pedido</w:t>
+            </w:r>
+          </w:p>
+        </w:tc>
+      </w:tr>
+      <w:tr>
+        <w:tc>
+          <w:tcPr>
+            <w:tcW w:type="dxa" w:w="2835"/>
+          </w:tcPr>
+          <w:p>
+            <w:r>
+              <w:rPr>
+                <w:sz w:val="18"/>
+              </w:rPr>
+              <w:t>Seguridad (robustez ante entradas no confiables) · Fallback del intérprete validado contra contrato acotado</w:t>
+            </w:r>
+          </w:p>
+        </w:tc>
+        <w:tc>
+          <w:tcPr>
+            <w:tcW w:type="dxa" w:w="2835"/>
+          </w:tcPr>
+          <w:p>
+            <w:r>
+              <w:rPr>
+                <w:sz w:val="18"/>
+              </w:rPr>
+              <w:t>A</w:t>
+            </w:r>
+          </w:p>
+        </w:tc>
+        <w:tc>
+          <w:tcPr>
+            <w:tcW w:type="dxa" w:w="2835"/>
+          </w:tcPr>
+          <w:p>
+            <w:r>
+              <w:rPr>
+                <w:sz w:val="18"/>
+              </w:rPr>
+              <w:t>La salida del modelo en el fallback se valida contra un contrato acotado: una salida manipulada no produce una intención inexistente; la que no cumple se descarta; una falla del intérprete no propaga excepción</w:t>
             </w:r>
           </w:p>
         </w:tc>
@@ -1085,33 +1254,115 @@
               <w:rPr>
                 <w:sz w:val="18"/>
               </w:rPr>
-              <w:t>Seguridad · Factores de (ciber)seguridad del estrato</w:t>
-            </w:r>
-          </w:p>
-        </w:tc>
-        <w:tc>
-          <w:tcPr>
-            <w:tcW w:type="dxa" w:w="2835"/>
-          </w:tcPr>
-          <w:p>
-            <w:r>
-              <w:rPr>
-                <w:sz w:val="18"/>
-              </w:rPr>
-              <w:t>Remite</w:t>
-            </w:r>
-          </w:p>
-        </w:tc>
-        <w:tc>
-          <w:tcPr>
-            <w:tcW w:type="dxa" w:w="2835"/>
-          </w:tcPr>
-          <w:p>
-            <w:r>
-              <w:rPr>
-                <w:sz w:val="18"/>
-              </w:rPr>
-              <w:t>El perfil de seguridad de este estrato se declara en el Anexo 3 del laboratorio (perfil de seguridad del sistema de demostración, issues #58 y #108); este anexo lo remite y no lo reescribe.</w:t>
+              <w:t>Seguridad (integridad) · Gate de salida fail-closed</w:t>
+            </w:r>
+          </w:p>
+        </w:tc>
+        <w:tc>
+          <w:tcPr>
+            <w:tcW w:type="dxa" w:w="2835"/>
+          </w:tcPr>
+          <w:p>
+            <w:r>
+              <w:rPr>
+                <w:sz w:val="18"/>
+              </w:rPr>
+              <w:t>A</w:t>
+            </w:r>
+          </w:p>
+        </w:tc>
+        <w:tc>
+          <w:tcPr>
+            <w:tcW w:type="dxa" w:w="2835"/>
+          </w:tcPr>
+          <w:p>
+            <w:r>
+              <w:rPr>
+                <w:sz w:val="18"/>
+              </w:rPr>
+              <w:t>El gate descarta la salida entera ante cualquier incumplimiento verificable: variable faltante, desconocida o renombrada, dígito, fecha, importe, correo o enlace escritos por el modelo, hecho copiado de la fuente, dato personal, eco de prompting, promesa prohibida, salida truncada o registro no rioplatense</w:t>
+            </w:r>
+          </w:p>
+        </w:tc>
+      </w:tr>
+      <w:tr>
+        <w:tc>
+          <w:tcPr>
+            <w:tcW w:type="dxa" w:w="2835"/>
+          </w:tcPr>
+          <w:p>
+            <w:r>
+              <w:rPr>
+                <w:sz w:val="18"/>
+              </w:rPr>
+              <w:t>Seguridad (integridad) · Marca de borrador revalidada en el destino</w:t>
+            </w:r>
+          </w:p>
+        </w:tc>
+        <w:tc>
+          <w:tcPr>
+            <w:tcW w:type="dxa" w:w="2835"/>
+          </w:tcPr>
+          <w:p>
+            <w:r>
+              <w:rPr>
+                <w:sz w:val="18"/>
+              </w:rPr>
+              <w:t>A</w:t>
+            </w:r>
+          </w:p>
+        </w:tc>
+        <w:tc>
+          <w:tcPr>
+            <w:tcW w:type="dxa" w:w="2835"/>
+          </w:tcPr>
+          <w:p>
+            <w:r>
+              <w:rPr>
+                <w:sz w:val="18"/>
+              </w:rPr>
+              <w:t>Todo contenido debe empezar con BORRADOR — NO PUBLICAR; el adapter rechaza cualquier texto sin esa cabecera, aunque se construya por otro camino y se saltee el pipeline</w:t>
+            </w:r>
+          </w:p>
+        </w:tc>
+      </w:tr>
+      <w:tr>
+        <w:tc>
+          <w:tcPr>
+            <w:tcW w:type="dxa" w:w="2835"/>
+          </w:tcPr>
+          <w:p>
+            <w:r>
+              <w:rPr>
+                <w:sz w:val="18"/>
+              </w:rPr>
+              <w:t>Seguridad (disponibilidad) · Modelo local sin salida a internet</w:t>
+            </w:r>
+          </w:p>
+        </w:tc>
+        <w:tc>
+          <w:tcPr>
+            <w:tcW w:type="dxa" w:w="2835"/>
+          </w:tcPr>
+          <w:p>
+            <w:r>
+              <w:rPr>
+                <w:sz w:val="18"/>
+              </w:rPr>
+              <w:t>A</w:t>
+            </w:r>
+          </w:p>
+        </w:tc>
+        <w:tc>
+          <w:tcPr>
+            <w:tcW w:type="dxa" w:w="2835"/>
+          </w:tcPr>
+          <w:p>
+            <w:r>
+              <w:rPr>
+                <w:sz w:val="18"/>
+              </w:rPr>
+              <w:t>Doble barrera. En código, el adapter de Ollama sólo acepta localhost o una IP de loopback. En el despliegue, Ollama corre en su propio contenedor en la red interna modelo de Docker, que no tiene salida a internet; el agente llega a él por un relay en 127.0.0.1:11434 dentro de su contenedor, así que el control del adapter no se afloja. Verificado en el servidor el 23/10: desde el contenedor de Ollama no hay ruta ni DNS externo</w:t>
             </w:r>
           </w:p>
         </w:tc>
@@ -1319,33 +1570,74 @@
               <w:rPr>
                 <w:sz w:val="18"/>
               </w:rPr>
-              <w:t>Seguridad · Factores de (ciber)seguridad del estrato</w:t>
-            </w:r>
-          </w:p>
-        </w:tc>
-        <w:tc>
-          <w:tcPr>
-            <w:tcW w:type="dxa" w:w="2835"/>
-          </w:tcPr>
-          <w:p>
-            <w:r>
-              <w:rPr>
-                <w:sz w:val="18"/>
-              </w:rPr>
-              <w:t>Remite</w:t>
-            </w:r>
-          </w:p>
-        </w:tc>
-        <w:tc>
-          <w:tcPr>
-            <w:tcW w:type="dxa" w:w="2835"/>
-          </w:tcPr>
-          <w:p>
-            <w:r>
-              <w:rPr>
-                <w:sz w:val="18"/>
-              </w:rPr>
-              <w:t>El perfil de seguridad de este estrato se declara en el Anexo 3 del laboratorio (perfil de seguridad del sistema de demostración, issues #58 y #108); este anexo lo remite y no lo reescribe.</w:t>
+              <w:t>Seguridad (autorización) · Fail-closed por tipo y origen</w:t>
+            </w:r>
+          </w:p>
+        </w:tc>
+        <w:tc>
+          <w:tcPr>
+            <w:tcW w:type="dxa" w:w="2835"/>
+          </w:tcPr>
+          <w:p>
+            <w:r>
+              <w:rPr>
+                <w:sz w:val="18"/>
+              </w:rPr>
+              <w:t>A</w:t>
+            </w:r>
+          </w:p>
+        </w:tc>
+        <w:tc>
+          <w:tcPr>
+            <w:tcW w:type="dxa" w:w="2835"/>
+          </w:tcPr>
+          <w:p>
+            <w:r>
+              <w:rPr>
+                <w:sz w:val="18"/>
+              </w:rPr>
+              <w:t>Un tipo de notificación fuera del catálogo es INVALIDA; un origen no permitido bloquea el envío; una regla NO_MECANIZABLE no se aplica ni se declara cumplida</w:t>
+            </w:r>
+          </w:p>
+        </w:tc>
+      </w:tr>
+      <w:tr>
+        <w:tc>
+          <w:tcPr>
+            <w:tcW w:type="dxa" w:w="2835"/>
+          </w:tcPr>
+          <w:p>
+            <w:r>
+              <w:rPr>
+                <w:sz w:val="18"/>
+              </w:rPr>
+              <w:t>Seguridad (integridad) · Integridad del gate (SLO del 100 %)</w:t>
+            </w:r>
+          </w:p>
+        </w:tc>
+        <w:tc>
+          <w:tcPr>
+            <w:tcW w:type="dxa" w:w="2835"/>
+          </w:tcPr>
+          <w:p>
+            <w:r>
+              <w:rPr>
+                <w:sz w:val="18"/>
+              </w:rPr>
+              <w:t>A</w:t>
+            </w:r>
+          </w:p>
+        </w:tc>
+        <w:tc>
+          <w:tcPr>
+            <w:tcW w:type="dxa" w:w="2835"/>
+          </w:tcPr>
+          <w:p>
+            <w:r>
+              <w:rPr>
+                <w:sz w:val="18"/>
+              </w:rPr>
+              <w:t>Ninguna pieza no conforme se presenta como conforme; cada regla tiene código de gate y caso negativo; la suite falla si se agrega una regla activa sin regresión</w:t>
             </w:r>
           </w:p>
         </w:tc>
@@ -1553,33 +1845,115 @@
               <w:rPr>
                 <w:sz w:val="18"/>
               </w:rPr>
-              <w:t>Seguridad · Factores de (ciber)seguridad del estrato</w:t>
-            </w:r>
-          </w:p>
-        </w:tc>
-        <w:tc>
-          <w:tcPr>
-            <w:tcW w:type="dxa" w:w="2835"/>
-          </w:tcPr>
-          <w:p>
-            <w:r>
-              <w:rPr>
-                <w:sz w:val="18"/>
-              </w:rPr>
-              <w:t>Remite</w:t>
-            </w:r>
-          </w:p>
-        </w:tc>
-        <w:tc>
-          <w:tcPr>
-            <w:tcW w:type="dxa" w:w="2835"/>
-          </w:tcPr>
-          <w:p>
-            <w:r>
-              <w:rPr>
-                <w:sz w:val="18"/>
-              </w:rPr>
-              <w:t>El perfil de seguridad de este estrato se declara en el Anexo 3 del laboratorio (perfil de seguridad del sistema de demostración, issues #58 y #108); este anexo lo remite y no lo reescribe.</w:t>
+              <w:t>Seguridad (autorización) · Buzón propio de sólo lectura</w:t>
+            </w:r>
+          </w:p>
+        </w:tc>
+        <w:tc>
+          <w:tcPr>
+            <w:tcW w:type="dxa" w:w="2835"/>
+          </w:tcPr>
+          <w:p>
+            <w:r>
+              <w:rPr>
+                <w:sz w:val="18"/>
+              </w:rPr>
+              <w:t>A</w:t>
+            </w:r>
+          </w:p>
+        </w:tc>
+        <w:tc>
+          <w:tcPr>
+            <w:tcW w:type="dxa" w:w="2835"/>
+          </w:tcPr>
+          <w:p>
+            <w:r>
+              <w:rPr>
+                <w:sz w:val="18"/>
+              </w:rPr>
+              <w:t>El buzón se lee con gmail.readonly, sobre el usuario me literal, con exactamente tres endpoints de lectura; no hay modify, trash, send ni labels (ADR 0004)</w:t>
+            </w:r>
+          </w:p>
+        </w:tc>
+      </w:tr>
+      <w:tr>
+        <w:tc>
+          <w:tcPr>
+            <w:tcW w:type="dxa" w:w="2835"/>
+          </w:tcPr>
+          <w:p>
+            <w:r>
+              <w:rPr>
+                <w:sz w:val="18"/>
+              </w:rPr>
+              <w:t>Seguridad (confidencialidad) · Nada se persiste; adjuntos hasheados en memoria</w:t>
+            </w:r>
+          </w:p>
+        </w:tc>
+        <w:tc>
+          <w:tcPr>
+            <w:tcW w:type="dxa" w:w="2835"/>
+          </w:tcPr>
+          <w:p>
+            <w:r>
+              <w:rPr>
+                <w:sz w:val="18"/>
+              </w:rPr>
+              <w:t>A</w:t>
+            </w:r>
+          </w:p>
+        </w:tc>
+        <w:tc>
+          <w:tcPr>
+            <w:tcW w:type="dxa" w:w="2835"/>
+          </w:tcPr>
+          <w:p>
+            <w:r>
+              <w:rPr>
+                <w:sz w:val="18"/>
+              </w:rPr>
+              <w:t>El informe de control de pagos sale por stdout en JSON ordenado y no se persiste; los adjuntos del buzón se hashean en memoria y el contenido no puede llegar a un modelo (el mensaje no tiene campo para él)</w:t>
+            </w:r>
+          </w:p>
+        </w:tc>
+      </w:tr>
+      <w:tr>
+        <w:tc>
+          <w:tcPr>
+            <w:tcW w:type="dxa" w:w="2835"/>
+          </w:tcPr>
+          <w:p>
+            <w:r>
+              <w:rPr>
+                <w:sz w:val="18"/>
+              </w:rPr>
+              <w:t>Seguridad (integridad) · Situación de pago derivada, sin estado propio</w:t>
+            </w:r>
+          </w:p>
+        </w:tc>
+        <w:tc>
+          <w:tcPr>
+            <w:tcW w:type="dxa" w:w="2835"/>
+          </w:tcPr>
+          <w:p>
+            <w:r>
+              <w:rPr>
+                <w:sz w:val="18"/>
+              </w:rPr>
+              <w:t>A</w:t>
+            </w:r>
+          </w:p>
+        </w:tc>
+        <w:tc>
+          <w:tcPr>
+            <w:tcW w:type="dxa" w:w="2835"/>
+          </w:tcPr>
+          <w:p>
+            <w:r>
+              <w:rPr>
+                <w:sz w:val="18"/>
+              </w:rPr>
+              <w:t>La situación se recalcula como función pura en cada corrida (ADR 0003); un comprobante presentado nunca cuenta como pago confirmado; una respuesta no asociada se informa sin interpretar su contenido</w:t>
             </w:r>
           </w:p>
         </w:tc>
@@ -1787,33 +2161,115 @@
               <w:rPr>
                 <w:sz w:val="18"/>
               </w:rPr>
-              <w:t>Seguridad · Factores de (ciber)seguridad del estrato</w:t>
-            </w:r>
-          </w:p>
-        </w:tc>
-        <w:tc>
-          <w:tcPr>
-            <w:tcW w:type="dxa" w:w="2835"/>
-          </w:tcPr>
-          <w:p>
-            <w:r>
-              <w:rPr>
-                <w:sz w:val="18"/>
-              </w:rPr>
-              <w:t>Remite</w:t>
-            </w:r>
-          </w:p>
-        </w:tc>
-        <w:tc>
-          <w:tcPr>
-            <w:tcW w:type="dxa" w:w="2835"/>
-          </w:tcPr>
-          <w:p>
-            <w:r>
-              <w:rPr>
-                <w:sz w:val="18"/>
-              </w:rPr>
-              <w:t>El perfil de seguridad de este estrato se declara en el Anexo 3 del laboratorio (perfil de seguridad del sistema de demostración, issues #58 y #108); este anexo lo remite y no lo reescribe.</w:t>
+              <w:t>Seguridad (autenticación) · Identidad verificada por Google en el Form de decisiones</w:t>
+            </w:r>
+          </w:p>
+        </w:tc>
+        <w:tc>
+          <w:tcPr>
+            <w:tcW w:type="dxa" w:w="2835"/>
+          </w:tcPr>
+          <w:p>
+            <w:r>
+              <w:rPr>
+                <w:sz w:val="18"/>
+              </w:rPr>
+              <w:t>A</w:t>
+            </w:r>
+          </w:p>
+        </w:tc>
+        <w:tc>
+          <w:tcPr>
+            <w:tcW w:type="dxa" w:w="2835"/>
+          </w:tcPr>
+          <w:p>
+            <w:r>
+              <w:rPr>
+                <w:sz w:val="18"/>
+              </w:rPr>
+              <w:t>El Form restringe al dominio y recolecta el correo verificado; el rol sale del padrón externo (ADR 0005, ADR 0008)</w:t>
+            </w:r>
+          </w:p>
+        </w:tc>
+      </w:tr>
+      <w:tr>
+        <w:tc>
+          <w:tcPr>
+            <w:tcW w:type="dxa" w:w="2835"/>
+          </w:tcPr>
+          <w:p>
+            <w:r>
+              <w:rPr>
+                <w:sz w:val="18"/>
+              </w:rPr>
+              <w:t>Seguridad (integridad) · Links alterados y objetos inexistentes se rechazan</w:t>
+            </w:r>
+          </w:p>
+        </w:tc>
+        <w:tc>
+          <w:tcPr>
+            <w:tcW w:type="dxa" w:w="2835"/>
+          </w:tcPr>
+          <w:p>
+            <w:r>
+              <w:rPr>
+                <w:sz w:val="18"/>
+              </w:rPr>
+              <w:t>A</w:t>
+            </w:r>
+          </w:p>
+        </w:tc>
+        <w:tc>
+          <w:tcPr>
+            <w:tcW w:type="dxa" w:w="2835"/>
+          </w:tcPr>
+          <w:p>
+            <w:r>
+              <w:rPr>
+                <w:sz w:val="18"/>
+              </w:rPr>
+              <w:t>Un link alterado en tipo, decisión, objeto o id inexistente produce un rechazo con código estable; un objeto sólo vale si el agente lo declaró pendiente; registrar una decisión no dispara ninguna acción</w:t>
+            </w:r>
+          </w:p>
+        </w:tc>
+      </w:tr>
+      <w:tr>
+        <w:tc>
+          <w:tcPr>
+            <w:tcW w:type="dxa" w:w="2835"/>
+          </w:tcPr>
+          <w:p>
+            <w:r>
+              <w:rPr>
+                <w:sz w:val="18"/>
+              </w:rPr>
+              <w:t>Seguridad (integridad) · La aprobación ata el objeto por sha256</w:t>
+            </w:r>
+          </w:p>
+        </w:tc>
+        <w:tc>
+          <w:tcPr>
+            <w:tcW w:type="dxa" w:w="2835"/>
+          </w:tcPr>
+          <w:p>
+            <w:r>
+              <w:rPr>
+                <w:sz w:val="18"/>
+              </w:rPr>
+              <w:t>A</w:t>
+            </w:r>
+          </w:p>
+        </w:tc>
+        <w:tc>
+          <w:tcPr>
+            <w:tcW w:type="dxa" w:w="2835"/>
+          </w:tcPr>
+          <w:p>
+            <w:r>
+              <w:rPr>
+                <w:sz w:val="18"/>
+              </w:rPr>
+              <w:t>Editar la lista de cierre o la plantilla cambia el sha256 del objeto y la aprobación previa deja de aplicar; una decisión sobre otro texto, otra actividad u otro rol no aprueba esta línea</w:t>
             </w:r>
           </w:p>
         </w:tc>
@@ -2021,33 +2477,115 @@
               <w:rPr>
                 <w:sz w:val="18"/>
               </w:rPr>
-              <w:t>Seguridad · Factores de (ciber)seguridad del estrato</w:t>
-            </w:r>
-          </w:p>
-        </w:tc>
-        <w:tc>
-          <w:tcPr>
-            <w:tcW w:type="dxa" w:w="2835"/>
-          </w:tcPr>
-          <w:p>
-            <w:r>
-              <w:rPr>
-                <w:sz w:val="18"/>
-              </w:rPr>
-              <w:t>Remite</w:t>
-            </w:r>
-          </w:p>
-        </w:tc>
-        <w:tc>
-          <w:tcPr>
-            <w:tcW w:type="dxa" w:w="2835"/>
-          </w:tcPr>
-          <w:p>
-            <w:r>
-              <w:rPr>
-                <w:sz w:val="18"/>
-              </w:rPr>
-              <w:t>El perfil de seguridad de este estrato se declara en el Anexo 3 del laboratorio (perfil de seguridad del sistema de demostración, issues #58 y #108); este anexo lo remite y no lo reescribe.</w:t>
+              <w:t>Seguridad (autorización) · Doble aprobación obligatoria por máquina de estados</w:t>
+            </w:r>
+          </w:p>
+        </w:tc>
+        <w:tc>
+          <w:tcPr>
+            <w:tcW w:type="dxa" w:w="2835"/>
+          </w:tcPr>
+          <w:p>
+            <w:r>
+              <w:rPr>
+                <w:sz w:val="18"/>
+              </w:rPr>
+              <w:t>A</w:t>
+            </w:r>
+          </w:p>
+        </w:tc>
+        <w:tc>
+          <w:tcPr>
+            <w:tcW w:type="dxa" w:w="2835"/>
+          </w:tcPr>
+          <w:p>
+            <w:r>
+              <w:rPr>
+                <w:sz w:val="18"/>
+              </w:rPr>
+              <w:t>Sin las dos aprobaciones (semántica del RGC y utilitaria del Coordinador) registradas no hay encolado ni entrega; el destino habilitado se compara por tipo exacto, nunca por isinstance</w:t>
+            </w:r>
+          </w:p>
+        </w:tc>
+      </w:tr>
+      <w:tr>
+        <w:tc>
+          <w:tcPr>
+            <w:tcW w:type="dxa" w:w="2835"/>
+          </w:tcPr>
+          <w:p>
+            <w:r>
+              <w:rPr>
+                <w:sz w:val="18"/>
+              </w:rPr>
+              <w:t>Seguridad (autorización) · Lista de prueba del envío</w:t>
+            </w:r>
+          </w:p>
+        </w:tc>
+        <w:tc>
+          <w:tcPr>
+            <w:tcW w:type="dxa" w:w="2835"/>
+          </w:tcPr>
+          <w:p>
+            <w:r>
+              <w:rPr>
+                <w:sz w:val="18"/>
+              </w:rPr>
+              <w:t>A</w:t>
+            </w:r>
+          </w:p>
+        </w:tc>
+        <w:tc>
+          <w:tcPr>
+            <w:tcW w:type="dxa" w:w="2835"/>
+          </w:tcPr>
+          <w:p>
+            <w:r>
+              <w:rPr>
+                <w:sz w:val="18"/>
+              </w:rPr>
+              <w:t>gmail.send opera cercado por una lista de direcciones de prueba que sale de configuración fuera del repo; un destinatario fuera de la lista se rechaza antes del token y de la red, sin reintento</w:t>
+            </w:r>
+          </w:p>
+        </w:tc>
+      </w:tr>
+      <w:tr>
+        <w:tc>
+          <w:tcPr>
+            <w:tcW w:type="dxa" w:w="2835"/>
+          </w:tcPr>
+          <w:p>
+            <w:r>
+              <w:rPr>
+                <w:sz w:val="18"/>
+              </w:rPr>
+              <w:t>Seguridad (integridad) · Idempotencia durable y reconciliación</w:t>
+            </w:r>
+          </w:p>
+        </w:tc>
+        <w:tc>
+          <w:tcPr>
+            <w:tcW w:type="dxa" w:w="2835"/>
+          </w:tcPr>
+          <w:p>
+            <w:r>
+              <w:rPr>
+                <w:sz w:val="18"/>
+              </w:rPr>
+              <w:t>A</w:t>
+            </w:r>
+          </w:p>
+        </w:tc>
+        <w:tc>
+          <w:tcPr>
+            <w:tcW w:type="dxa" w:w="2835"/>
+          </w:tcPr>
+          <w:p>
+            <w:r>
+              <w:rPr>
+                <w:sz w:val="18"/>
+              </w:rPr>
+              <w:t>Reserva intermedia con reconciliación: una reserva colgada pasa a ENVIO_INDETERMINADO sin reenviar; la idempotencia por clave absorbe re-corridas (DUPLICADA); dos creaciones en paralelo producen un solo borrador</w:t>
             </w:r>
           </w:p>
         </w:tc>
@@ -2255,33 +2793,115 @@
               <w:rPr>
                 <w:sz w:val="18"/>
               </w:rPr>
-              <w:t>Seguridad · Factores de (ciber)seguridad del estrato</w:t>
-            </w:r>
-          </w:p>
-        </w:tc>
-        <w:tc>
-          <w:tcPr>
-            <w:tcW w:type="dxa" w:w="2835"/>
-          </w:tcPr>
-          <w:p>
-            <w:r>
-              <w:rPr>
-                <w:sz w:val="18"/>
-              </w:rPr>
-              <w:t>Remite</w:t>
-            </w:r>
-          </w:p>
-        </w:tc>
-        <w:tc>
-          <w:tcPr>
-            <w:tcW w:type="dxa" w:w="2835"/>
-          </w:tcPr>
-          <w:p>
-            <w:r>
-              <w:rPr>
-                <w:sz w:val="18"/>
-              </w:rPr>
-              <w:t>El perfil de seguridad de este estrato se declara en el Anexo 3 del laboratorio (perfil de seguridad del sistema de demostración, issues #58 y #108); este anexo lo remite y no lo reescribe.</w:t>
+              <w:t>Seguridad (confidencialidad) · Almacenamiento de credenciales y contraseñas</w:t>
+            </w:r>
+          </w:p>
+        </w:tc>
+        <w:tc>
+          <w:tcPr>
+            <w:tcW w:type="dxa" w:w="2835"/>
+          </w:tcPr>
+          <w:p>
+            <w:r>
+              <w:rPr>
+                <w:sz w:val="18"/>
+              </w:rPr>
+              <w:t>No aplica</w:t>
+            </w:r>
+          </w:p>
+        </w:tc>
+        <w:tc>
+          <w:tcPr>
+            <w:tcW w:type="dxa" w:w="2835"/>
+          </w:tcPr>
+          <w:p>
+            <w:r>
+              <w:rPr>
+                <w:sz w:val="18"/>
+              </w:rPr>
+              <w:t>No aplica: el sistema no almacena contraseñas ni tiene base de usuarios. La identidad es una cuenta de servicio de Google con delegación y nadie inicia sesión con ella; no hay adapter de base de datos cableado, la persistencia del producto es un puerto en memoria que guarda sólo referencias opacas y hashes, y los reportes rechazan campos sensibles aunque el valor no esté declarado. El único secreto es la clave JSON de la cuenta de servicio, custodiada fuera del repo con chmod 600 (ver «Custodia y transporte del secreto», en Google Workspace)</w:t>
+            </w:r>
+          </w:p>
+        </w:tc>
+      </w:tr>
+      <w:tr>
+        <w:tc>
+          <w:tcPr>
+            <w:tcW w:type="dxa" w:w="2835"/>
+          </w:tcPr>
+          <w:p>
+            <w:r>
+              <w:rPr>
+                <w:sz w:val="18"/>
+              </w:rPr>
+              <w:t>Seguridad (confidencialidad) · Auditoría y reportes sólo de códigos, conteos y hashes</w:t>
+            </w:r>
+          </w:p>
+        </w:tc>
+        <w:tc>
+          <w:tcPr>
+            <w:tcW w:type="dxa" w:w="2835"/>
+          </w:tcPr>
+          <w:p>
+            <w:r>
+              <w:rPr>
+                <w:sz w:val="18"/>
+              </w:rPr>
+              <w:t>A</w:t>
+            </w:r>
+          </w:p>
+        </w:tc>
+        <w:tc>
+          <w:tcPr>
+            <w:tcW w:type="dxa" w:w="2835"/>
+          </w:tcPr>
+          <w:p>
+            <w:r>
+              <w:rPr>
+                <w:sz w:val="18"/>
+              </w:rPr>
+              <w:t>El reporte de seguridad D2/D3 expone códigos, conteos y hashes opacos; nunca contenido, destinatarios ni cuerpos; rechaza campos sensibles aunque el valor no esté declarado</w:t>
+            </w:r>
+          </w:p>
+        </w:tc>
+      </w:tr>
+      <w:tr>
+        <w:tc>
+          <w:tcPr>
+            <w:tcW w:type="dxa" w:w="2835"/>
+          </w:tcPr>
+          <w:p>
+            <w:r>
+              <w:rPr>
+                <w:sz w:val="18"/>
+              </w:rPr>
+              <w:t>Seguridad (integridad) · Registros durables fail-closed</w:t>
+            </w:r>
+          </w:p>
+        </w:tc>
+        <w:tc>
+          <w:tcPr>
+            <w:tcW w:type="dxa" w:w="2835"/>
+          </w:tcPr>
+          <w:p>
+            <w:r>
+              <w:rPr>
+                <w:sz w:val="18"/>
+              </w:rPr>
+              <w:t>A</w:t>
+            </w:r>
+          </w:p>
+        </w:tc>
+        <w:tc>
+          <w:tcPr>
+            <w:tcW w:type="dxa" w:w="2835"/>
+          </w:tcPr>
+          <w:p>
+            <w:r>
+              <w:rPr>
+                <w:sz w:val="18"/>
+              </w:rPr>
+              <w:t>Un registro corrupto se trata como ausente y no habilita entrega, o interrumpe la lectura; una clave que no es un hash no elige dónde se escribe</w:t>
             </w:r>
           </w:p>
         </w:tc>
@@ -2489,33 +3109,115 @@
               <w:rPr>
                 <w:sz w:val="18"/>
               </w:rPr>
-              <w:t>Seguridad · Factores de (ciber)seguridad del estrato</w:t>
-            </w:r>
-          </w:p>
-        </w:tc>
-        <w:tc>
-          <w:tcPr>
-            <w:tcW w:type="dxa" w:w="2835"/>
-          </w:tcPr>
-          <w:p>
-            <w:r>
-              <w:rPr>
-                <w:sz w:val="18"/>
-              </w:rPr>
-              <w:t>Remite</w:t>
-            </w:r>
-          </w:p>
-        </w:tc>
-        <w:tc>
-          <w:tcPr>
-            <w:tcW w:type="dxa" w:w="2835"/>
-          </w:tcPr>
-          <w:p>
-            <w:r>
-              <w:rPr>
-                <w:sz w:val="18"/>
-              </w:rPr>
-              <w:t>El perfil de seguridad de este estrato se declara en el Anexo 3 del laboratorio (perfil de seguridad del sistema de demostración, issues #58 y #108); este anexo lo remite y no lo reescribe.</w:t>
+              <w:t>Seguridad (autorización) · Allowlist de hosts del plano de datos</w:t>
+            </w:r>
+          </w:p>
+        </w:tc>
+        <w:tc>
+          <w:tcPr>
+            <w:tcW w:type="dxa" w:w="2835"/>
+          </w:tcPr>
+          <w:p>
+            <w:r>
+              <w:rPr>
+                <w:sz w:val="18"/>
+              </w:rPr>
+              <w:t>A</w:t>
+            </w:r>
+          </w:p>
+        </w:tc>
+        <w:tc>
+          <w:tcPr>
+            <w:tcW w:type="dxa" w:w="2835"/>
+          </w:tcPr>
+          <w:p>
+            <w:r>
+              <w:rPr>
+                <w:sz w:val="18"/>
+              </w:rPr>
+              <w:t>El agente sólo toca sheets.googleapis.com, docs.googleapis.com, www.googleapis.com y gmail.googleapis.com (lectura propia); la auditoría contrasta las llamadas reales contra esa lista y rechaza endpoints de distribución</w:t>
+            </w:r>
+          </w:p>
+        </w:tc>
+      </w:tr>
+      <w:tr>
+        <w:tc>
+          <w:tcPr>
+            <w:tcW w:type="dxa" w:w="2835"/>
+          </w:tcPr>
+          <w:p>
+            <w:r>
+              <w:rPr>
+                <w:sz w:val="18"/>
+              </w:rPr>
+              <w:t>Seguridad (confidencialidad) · El token nunca se guarda ni se registra</w:t>
+            </w:r>
+          </w:p>
+        </w:tc>
+        <w:tc>
+          <w:tcPr>
+            <w:tcW w:type="dxa" w:w="2835"/>
+          </w:tcPr>
+          <w:p>
+            <w:r>
+              <w:rPr>
+                <w:sz w:val="18"/>
+              </w:rPr>
+              <w:t>A</w:t>
+            </w:r>
+          </w:p>
+        </w:tc>
+        <w:tc>
+          <w:tcPr>
+            <w:tcW w:type="dxa" w:w="2835"/>
+          </w:tcPr>
+          <w:p>
+            <w:r>
+              <w:rPr>
+                <w:sz w:val="18"/>
+              </w:rPr>
+              <w:t>El token se pide por operación, se valida que no tenga saltos de línea (no se puede inyectar cabecera) y se usa sólo en el header Authorization; los errores HTTP se mapean sin filtrar token ni cuerpo</w:t>
+            </w:r>
+          </w:p>
+        </w:tc>
+      </w:tr>
+      <w:tr>
+        <w:tc>
+          <w:tcPr>
+            <w:tcW w:type="dxa" w:w="2835"/>
+          </w:tcPr>
+          <w:p>
+            <w:r>
+              <w:rPr>
+                <w:sz w:val="18"/>
+              </w:rPr>
+              <w:t>Seguridad (confidencialidad) · Cifrado en tránsito de las llamadas a Workspace (TLS)</w:t>
+            </w:r>
+          </w:p>
+        </w:tc>
+        <w:tc>
+          <w:tcPr>
+            <w:tcW w:type="dxa" w:w="2835"/>
+          </w:tcPr>
+          <w:p>
+            <w:r>
+              <w:rPr>
+                <w:sz w:val="18"/>
+              </w:rPr>
+              <w:t>A</w:t>
+            </w:r>
+          </w:p>
+        </w:tc>
+        <w:tc>
+          <w:tcPr>
+            <w:tcW w:type="dxa" w:w="2835"/>
+          </w:tcPr>
+          <w:p>
+            <w:r>
+              <w:rPr>
+                <w:sz w:val="18"/>
+              </w:rPr>
+              <w:t>Toda llamada a los servicios de Google viaja por HTTPS: el transporte usa http.client.HTTPSConnection contra el puerto 443 y la allowlist de hosts impide cualquier otro destino. El cliente es a mano y enumerable, sin SDK ni dependencias transitivas. El tráfico hacia el modelo no sale del servidor: va del contenedor del agente al de Ollama por la red interna de Docker, sin salida</w:t>
             </w:r>
           </w:p>
         </w:tc>
@@ -2544,6 +3246,199 @@
               <w:rPr>
                 <w:sz w:val="18"/>
               </w:rPr>
+              <w:t>Google Workspace</w:t>
+            </w:r>
+          </w:p>
+        </w:tc>
+      </w:tr>
+      <w:tr>
+        <w:tc>
+          <w:tcPr>
+            <w:tcW w:type="dxa" w:w="2835"/>
+          </w:tcPr>
+          <w:p>
+            <w:r>
+              <w:rPr>
+                <w:sz w:val="18"/>
+              </w:rPr>
+              <w:t>Atributo</w:t>
+            </w:r>
+          </w:p>
+        </w:tc>
+        <w:tc>
+          <w:tcPr>
+            <w:tcW w:type="dxa" w:w="964"/>
+          </w:tcPr>
+          <w:p>
+            <w:r>
+              <w:rPr>
+                <w:sz w:val="18"/>
+              </w:rPr>
+              <w:t>Estado</w:t>
+            </w:r>
+          </w:p>
+        </w:tc>
+        <w:tc>
+          <w:tcPr>
+            <w:tcW w:type="dxa" w:w="4706"/>
+          </w:tcPr>
+          <w:p>
+            <w:r>
+              <w:rPr>
+                <w:sz w:val="18"/>
+              </w:rPr>
+              <w:t>Motivo</w:t>
+            </w:r>
+          </w:p>
+        </w:tc>
+      </w:tr>
+      <w:tr>
+        <w:tc>
+          <w:tcPr>
+            <w:tcW w:type="dxa" w:w="2835"/>
+          </w:tcPr>
+          <w:p>
+            <w:r>
+              <w:rPr>
+                <w:sz w:val="18"/>
+              </w:rPr>
+              <w:t>Seguridad (autenticación) · Mecanismo de identidad (eje 1, I)</w:t>
+            </w:r>
+          </w:p>
+        </w:tc>
+        <w:tc>
+          <w:tcPr>
+            <w:tcW w:type="dxa" w:w="2835"/>
+          </w:tcPr>
+          <w:p>
+            <w:r>
+              <w:rPr>
+                <w:sz w:val="18"/>
+              </w:rPr>
+              <w:t>A</w:t>
+            </w:r>
+          </w:p>
+        </w:tc>
+        <w:tc>
+          <w:tcPr>
+            <w:tcW w:type="dxa" w:w="2835"/>
+          </w:tcPr>
+          <w:p>
+            <w:r>
+              <w:rPr>
+                <w:sz w:val="18"/>
+              </w:rPr>
+              <w:t>Cuenta de servicio en un proyecto de Google Cloud de DSI, con domain-wide delegation, que se hace pasar por la cuenta técnica bot_ia1@. Es lo que DSI prefiere y ya otorgó; el proyecto es de DSI, así que no queda nada a nombre del autor (ADR 0007)</w:t>
+            </w:r>
+          </w:p>
+        </w:tc>
+      </w:tr>
+      <w:tr>
+        <w:tc>
+          <w:tcPr>
+            <w:tcW w:type="dxa" w:w="2835"/>
+          </w:tcPr>
+          <w:p>
+            <w:r>
+              <w:rPr>
+                <w:sz w:val="18"/>
+              </w:rPr>
+              <w:t>Seguridad (autorización) · Riesgo aceptado de la delegación sobre el dominio</w:t>
+            </w:r>
+          </w:p>
+        </w:tc>
+        <w:tc>
+          <w:tcPr>
+            <w:tcW w:type="dxa" w:w="2835"/>
+          </w:tcPr>
+          <w:p>
+            <w:r>
+              <w:rPr>
+                <w:sz w:val="18"/>
+              </w:rPr>
+              <w:t>A + RA</w:t>
+            </w:r>
+          </w:p>
+        </w:tc>
+        <w:tc>
+          <w:tcPr>
+            <w:tcW w:type="dxa" w:w="2835"/>
+          </w:tcPr>
+          <w:p>
+            <w:r>
+              <w:rPr>
+                <w:sz w:val="18"/>
+              </w:rPr>
+              <w:t>RA (DSI, correo del 13/10): la delegación se autoriza por client ID para todo el dominio; con la clave se puede leer y enviar correo y acceder al Drive como cualquier cuenta de la FIE. Compensación: lista cerrada de cuentas suplantables (#98, ADR 0011), archivo controlado del repo con hashes que entra en el manifest; si el entorno indica otra cuenta, el agente no arranca</w:t>
+            </w:r>
+          </w:p>
+        </w:tc>
+      </w:tr>
+      <w:tr>
+        <w:tc>
+          <w:tcPr>
+            <w:tcW w:type="dxa" w:w="2835"/>
+          </w:tcPr>
+          <w:p>
+            <w:r>
+              <w:rPr>
+                <w:sz w:val="18"/>
+              </w:rPr>
+              <w:t>Seguridad (confidencialidad) · Custodia y transporte del secreto (eje 4, I + RA)</w:t>
+            </w:r>
+          </w:p>
+        </w:tc>
+        <w:tc>
+          <w:tcPr>
+            <w:tcW w:type="dxa" w:w="2835"/>
+          </w:tcPr>
+          <w:p>
+            <w:r>
+              <w:rPr>
+                <w:sz w:val="18"/>
+              </w:rPr>
+              <w:t>A + RA</w:t>
+            </w:r>
+          </w:p>
+        </w:tc>
+        <w:tc>
+          <w:tcPr>
+            <w:tcW w:type="dxa" w:w="2835"/>
+          </w:tcPr>
+          <w:p>
+            <w:r>
+              <w:rPr>
+                <w:sz w:val="18"/>
+              </w:rPr>
+              <w:t>La clave JSON vive sólo en el servidor, fuera del repo, con chmod 600, y se monta en sólo lectura en el contenedor del agente; nunca entra a la imagen ni a docker inspect. La copia recibida por correo y la que había en la laptop del autor se borraron. RA (el autor y DSI): el transporte inicial fue por correo interno del dominio con TLS, y el disco del servidor no está cifrado (LVM + ext4, verificado el 23/10; sin root no se puede cifrar). Control compensatorio: usuario sin privilegios, la clave sólo se hace pasar por la cuenta técnica (lista cerrada) y DSI la revoca. La credencial OAuth anterior se dio de baja el 23/10: refresh token revocado (Google responde invalid_grant) y proyecto de Google Cloud propio con apagado programado (#99)</w:t>
+            </w:r>
+          </w:p>
+        </w:tc>
+      </w:tr>
+    </w:tbl>
+    <w:tbl>
+      <w:tblPr>
+        <w:tblStyle w:val="Tablaconcuadrcula"/>
+        <w:tblW w:type="auto" w:w="0"/>
+        <w:tblLayout w:type="fixed"/>
+        <w:tblLook w:firstColumn="1" w:firstRow="1" w:lastColumn="0" w:lastRow="0" w:noHBand="0" w:noVBand="1" w:val="04A0"/>
+      </w:tblPr>
+      <w:tblGrid>
+        <w:gridCol w:w="2835"/>
+        <w:gridCol w:w="2835"/>
+        <w:gridCol w:w="2835"/>
+      </w:tblGrid>
+      <w:tr>
+        <w:tc>
+          <w:tcPr>
+            <w:tcW w:type="dxa" w:w="8505"/>
+            <w:gridSpan w:val="3"/>
+          </w:tcPr>
+          <w:p>
+            <w:r>
+              <w:rPr>
+                <w:sz w:val="18"/>
+              </w:rPr>
               <w:t>Sistema (atributos transversales)</w:t>
             </w:r>
           </w:p>
@@ -2723,33 +3618,115 @@
               <w:rPr>
                 <w:sz w:val="18"/>
               </w:rPr>
-              <w:t>Seguridad · Factores de (ciber)seguridad del estrato</w:t>
-            </w:r>
-          </w:p>
-        </w:tc>
-        <w:tc>
-          <w:tcPr>
-            <w:tcW w:type="dxa" w:w="2835"/>
-          </w:tcPr>
-          <w:p>
-            <w:r>
-              <w:rPr>
-                <w:sz w:val="18"/>
-              </w:rPr>
-              <w:t>Remite</w:t>
-            </w:r>
-          </w:p>
-        </w:tc>
-        <w:tc>
-          <w:tcPr>
-            <w:tcW w:type="dxa" w:w="2835"/>
-          </w:tcPr>
-          <w:p>
-            <w:r>
-              <w:rPr>
-                <w:sz w:val="18"/>
-              </w:rPr>
-              <w:t>El perfil de seguridad de este estrato se declara en el Anexo 3 del laboratorio (perfil de seguridad del sistema de demostración, issues #58 y #108); este anexo lo remite y no lo reescribe.</w:t>
+              <w:t>Seguridad (confidencialidad) · Secretos fuera del repo y del log</w:t>
+            </w:r>
+          </w:p>
+        </w:tc>
+        <w:tc>
+          <w:tcPr>
+            <w:tcW w:type="dxa" w:w="2835"/>
+          </w:tcPr>
+          <w:p>
+            <w:r>
+              <w:rPr>
+                <w:sz w:val="18"/>
+              </w:rPr>
+              <w:t>A</w:t>
+            </w:r>
+          </w:p>
+        </w:tc>
+        <w:tc>
+          <w:tcPr>
+            <w:tcW w:type="dxa" w:w="2835"/>
+          </w:tcPr>
+          <w:p>
+            <w:r>
+              <w:rPr>
+                <w:sz w:val="18"/>
+              </w:rPr>
+              <w:t>Ningún secreto se versiona ni se escribe en logs, manifests ni mensajes de error. El env file vive en ~/.config/agente1/ del servidor (chmod 600, fuera del repo) y el entrypoint lo carga en tiempo de ejecución: no entra a la imagen, a los build args ni a docker inspect. Los reportes publican hashes (resumen_seguro) y el runtime tiene cero dependencias</w:t>
+            </w:r>
+          </w:p>
+        </w:tc>
+      </w:tr>
+      <w:tr>
+        <w:tc>
+          <w:tcPr>
+            <w:tcW w:type="dxa" w:w="2835"/>
+          </w:tcPr>
+          <w:p>
+            <w:r>
+              <w:rPr>
+                <w:sz w:val="18"/>
+              </w:rPr>
+              <w:t>Seguridad (integridad) · Manifest de versión y arranque fail-closed</w:t>
+            </w:r>
+          </w:p>
+        </w:tc>
+        <w:tc>
+          <w:tcPr>
+            <w:tcW w:type="dxa" w:w="2835"/>
+          </w:tcPr>
+          <w:p>
+            <w:r>
+              <w:rPr>
+                <w:sz w:val="18"/>
+              </w:rPr>
+              <w:t>A</w:t>
+            </w:r>
+          </w:p>
+        </w:tc>
+        <w:tc>
+          <w:tcPr>
+            <w:tcW w:type="dxa" w:w="2835"/>
+          </w:tcPr>
+          <w:p>
+            <w:r>
+              <w:rPr>
+                <w:sz w:val="18"/>
+              </w:rPr>
+              <w:t>En modo operación el agente no arranca si algún archivo controlado (código, prompts, políticas, contratos, migraciones, uv.lock, scripts, systemd, Dockerfile y docker/) no coincide con el manifest; deja en logs/integridad-arranque.jsonl el archivo, el hash esperado y el encontrado (#92, ADR 0010). En el contenedor, el entrypoint verifica antes de lanzar cualquier comando; el CI prueba en cada cambio que un archivo alterado impide arrancar</w:t>
+            </w:r>
+          </w:p>
+        </w:tc>
+      </w:tr>
+      <w:tr>
+        <w:tc>
+          <w:tcPr>
+            <w:tcW w:type="dxa" w:w="2835"/>
+          </w:tcPr>
+          <w:p>
+            <w:r>
+              <w:rPr>
+                <w:sz w:val="18"/>
+              </w:rPr>
+              <w:t>Seguridad (integridad) · Ejecución en contenedores endurecidos</w:t>
+            </w:r>
+          </w:p>
+        </w:tc>
+        <w:tc>
+          <w:tcPr>
+            <w:tcW w:type="dxa" w:w="2835"/>
+          </w:tcPr>
+          <w:p>
+            <w:r>
+              <w:rPr>
+                <w:sz w:val="18"/>
+              </w:rPr>
+              <w:t>A</w:t>
+            </w:r>
+          </w:p>
+        </w:tc>
+        <w:tc>
+          <w:tcPr>
+            <w:tcW w:type="dxa" w:w="2835"/>
+          </w:tcPr>
+          <w:p>
+            <w:r>
+              <w:rPr>
+                <w:sz w:val="18"/>
+              </w:rPr>
+              <w:t>El agente y el modelo corren en contenedores (ADR 0013): usuario no root, sistema de archivos de sólo lectura, cap_drop: ALL, no-new-privileges, sin modo privilegiado y sin el socket de Docker. La imagen la publica el CI sólo al cortar una versión, fijada por digest, y la suite corre dentro de la imagen antes de publicarla; Portainer despliega sólo lo que apunta la rama deploy</w:t>
             </w:r>
           </w:p>
         </w:tc>

</xml_diff>